<commit_message>
fix(juridico): carta poder con el número de DPI en todas, CUBE en la de Don Alex, y sin PDF de datos viejos
- Las cartas de Don Alex (CUBE y RDBE) y de Richard ponían el DPI del cliente
  sólo en letras: ahora llevan el número entre paréntesis, como la de Andrés.
- En la de CUBE con Don Alex el punto PRIMERO decía que la propietaria es
  RDBE: dice CUBE INVESTMENTS, SOCIEDAD ANÓNIMA, la misma del encabezado.
- Si el formulario cambia mientras se genera, el PDF que vuelve (de los datos
  viejos) se descarta en vez de mostrarse.

Co-Authored-By: Claude Opus 5.5 <noreply@anthropic.com>
</commit_message>
<xml_diff>
--- a/apps/legal-docs-blueprints/templates/carta_poder/CARTA-CUBE-DON ALEX-HOMBRE.docx
+++ b/apps/legal-docs-blueprints/templates/carta_poder/CARTA-CUBE-DON ALEX-HOMBRE.docx
@@ -529,7 +529,7 @@
           <w:sz w:val="18"/>
           <w:szCs w:val="18"/>
         </w:rPr>
-        <w:t xml:space="preserve">me identifico con Documento Personal de Identificación, </w:t>
+        <w:t xml:space="preserve">me identifico con Documento Personal de Identificación, {dpiTexto} ({dpiNumero}) Código</w:t>
       </w:r>
       <w:sdt>
         <w:sdtPr>
@@ -559,15 +559,15 @@
           <w:sz w:val="18"/>
           <w:szCs w:val="18"/>
         </w:rPr>
-        <w:t>{dpiTexto}</w:t>
-      </w:r>
-      <w:r>
-        <w:rPr>
-          <w:rFonts w:eastAsia="Arial" w:cs="Arial" w:ascii="Arial" w:hAnsi="Arial"/>
-          <w:sz w:val="18"/>
-          <w:szCs w:val="18"/>
-        </w:rPr>
-        <w:t xml:space="preserve"> Código Único de Identificación  extendido por el Registro Nacional de las Personas –RENAP- República de Guatemala Centroamérica</w:t>
+        <w:t xml:space="preserve"/>
+      </w:r>
+      <w:r>
+        <w:rPr>
+          <w:rFonts w:eastAsia="Arial" w:cs="Arial" w:ascii="Arial" w:hAnsi="Arial"/>
+          <w:sz w:val="18"/>
+          <w:szCs w:val="18"/>
+        </w:rPr>
+        <w:t xml:space="preserve"> Único de Identificación  extendido por el Registro Nacional de las Personas –RENAP- República de Guatemala Centroamérica</w:t>
       </w:r>
       <w:r>
         <w:rPr>
@@ -616,27 +616,27 @@
           <w:sz w:val="18"/>
           <w:szCs w:val="18"/>
         </w:rPr>
-        <w:t xml:space="preserve"> en la calidad con que actúo, declaro que mi representada la entidad denominada </w:t>
-      </w:r>
-      <w:r>
-        <w:rPr>
-          <w:rFonts w:eastAsia="Arial" w:cs="Arial" w:ascii="Arial" w:hAnsi="Arial"/>
-          <w:b/>
-          <w:bCs/>
-          <w:color w:val="000000"/>
-          <w:sz w:val="18"/>
-          <w:szCs w:val="18"/>
-        </w:rPr>
-        <w:t>RDBE, SOCIEDAD ANÓNIMA,</w:t>
-      </w:r>
-      <w:r>
-        <w:rPr>
-          <w:rFonts w:eastAsia="Arial" w:cs="Arial" w:ascii="Arial" w:hAnsi="Arial"/>
-          <w:color w:val="000000"/>
-          <w:sz w:val="18"/>
-          <w:szCs w:val="18"/>
-        </w:rPr>
-        <w:t xml:space="preserve"> es legítima, única y actual propietaria del vehículo identificado con los datos siguientes:</w:t>
+        <w:t xml:space="preserve"> en la calidad con que actúo, declaro que mi representada la entidad denominada CUBE INVESTMENTS, SOCIEDAD ANÓNIMA, es legítima</w:t>
+      </w:r>
+      <w:r>
+        <w:rPr>
+          <w:rFonts w:eastAsia="Arial" w:cs="Arial" w:ascii="Arial" w:hAnsi="Arial"/>
+          <w:b/>
+          <w:bCs/>
+          <w:color w:val="000000"/>
+          <w:sz w:val="18"/>
+          <w:szCs w:val="18"/>
+        </w:rPr>
+        <w:t xml:space="preserve"/>
+      </w:r>
+      <w:r>
+        <w:rPr>
+          <w:rFonts w:eastAsia="Arial" w:cs="Arial" w:ascii="Arial" w:hAnsi="Arial"/>
+          <w:color w:val="000000"/>
+          <w:sz w:val="18"/>
+          <w:szCs w:val="18"/>
+        </w:rPr>
+        <w:t xml:space="preserve">, única y actual propietaria del vehículo identificado con los datos siguientes:</w:t>
       </w:r>
       <w:r>
         <w:rPr>

</xml_diff>